<commit_message>
Alterações no documento do artigo
</commit_message>
<xml_diff>
--- a/Orienteering_problem.docx
+++ b/Orienteering_problem.docx
@@ -194,7 +194,7 @@
           <w:szCs w:val="20"/>
         </w:rPr>
       </w:pPr>
-      <w:hyperlink r:id="rId5" w:history="1">
+      <w:hyperlink r:id="rId7" w:history="1">
         <w:r>
           <w:rPr>
             <w:rStyle w:val="Hyperlink"/>
@@ -213,7 +213,7 @@
         </w:rPr>
         <w:t xml:space="preserve">, </w:t>
       </w:r>
-      <w:hyperlink r:id="rId6" w:history="1">
+      <w:hyperlink r:id="rId8" w:history="1">
         <w:r>
           <w:rPr>
             <w:rStyle w:val="Hyperlink"/>
@@ -5674,11 +5674,15 @@
       <w:pPr>
         <w:rPr>
           <w:rFonts w:ascii="Times New Roman" w:hAnsi="Times New Roman" w:cs="Times New Roman"/>
+          <w:b/>
+          <w:bCs/>
           <w:sz w:val="26"/>
           <w:szCs w:val="26"/>
         </w:rPr>
       </w:pPr>
-      <w:r>
+    </w:p>
+    <w:p>
+      <w:pPr>
         <w:rPr>
           <w:rFonts w:ascii="Times New Roman" w:hAnsi="Times New Roman" w:cs="Times New Roman"/>
           <w:b/>
@@ -5686,9 +5690,10 @@
           <w:sz w:val="26"/>
           <w:szCs w:val="26"/>
         </w:rPr>
-        <w:t>Referênc</w:t>
-      </w:r>
-      <w:r>
+      </w:pPr>
+    </w:p>
+    <w:p>
+      <w:pPr>
         <w:rPr>
           <w:rFonts w:ascii="Times New Roman" w:hAnsi="Times New Roman" w:cs="Times New Roman"/>
           <w:b/>
@@ -5696,21 +5701,17 @@
           <w:sz w:val="26"/>
           <w:szCs w:val="26"/>
         </w:rPr>
-        <w:t>i</w:t>
-      </w:r>
-      <w:r>
-        <w:rPr>
-          <w:rFonts w:ascii="Times New Roman" w:hAnsi="Times New Roman" w:cs="Times New Roman"/>
-          <w:b/>
-          <w:bCs/>
+      </w:pPr>
+    </w:p>
+    <w:p>
+      <w:pPr>
+        <w:rPr>
+          <w:rFonts w:ascii="Times New Roman" w:hAnsi="Times New Roman" w:cs="Times New Roman"/>
           <w:sz w:val="26"/>
           <w:szCs w:val="26"/>
         </w:rPr>
-        <w:t>as</w:t>
-      </w:r>
-    </w:p>
-    <w:p>
-      <w:pPr>
+      </w:pPr>
+      <w:r>
         <w:rPr>
           <w:rFonts w:ascii="Times New Roman" w:hAnsi="Times New Roman" w:cs="Times New Roman"/>
           <w:b/>
@@ -5718,6 +5719,38 @@
           <w:sz w:val="26"/>
           <w:szCs w:val="26"/>
         </w:rPr>
+        <w:t>Referênc</w:t>
+      </w:r>
+      <w:r>
+        <w:rPr>
+          <w:rFonts w:ascii="Times New Roman" w:hAnsi="Times New Roman" w:cs="Times New Roman"/>
+          <w:b/>
+          <w:bCs/>
+          <w:sz w:val="26"/>
+          <w:szCs w:val="26"/>
+        </w:rPr>
+        <w:t>i</w:t>
+      </w:r>
+      <w:r>
+        <w:rPr>
+          <w:rFonts w:ascii="Times New Roman" w:hAnsi="Times New Roman" w:cs="Times New Roman"/>
+          <w:b/>
+          <w:bCs/>
+          <w:sz w:val="26"/>
+          <w:szCs w:val="26"/>
+        </w:rPr>
+        <w:t>as</w:t>
+      </w:r>
+    </w:p>
+    <w:p>
+      <w:pPr>
+        <w:rPr>
+          <w:rFonts w:ascii="Times New Roman" w:hAnsi="Times New Roman" w:cs="Times New Roman"/>
+          <w:b/>
+          <w:bCs/>
+          <w:sz w:val="26"/>
+          <w:szCs w:val="26"/>
+        </w:rPr>
       </w:pPr>
     </w:p>
     <w:p>
@@ -5733,7 +5766,6 @@
           <w:rFonts w:ascii="Times New Roman" w:hAnsi="Times New Roman" w:cs="Times New Roman"/>
           <w:lang w:val="en-US"/>
         </w:rPr>
-        <w:lastRenderedPageBreak/>
         <w:t>C</w:t>
       </w:r>
       <w:r>
@@ -5782,7 +5814,7 @@
         </w:rPr>
         <w:t xml:space="preserve">, R. (1987). “The Orienteering Problem”. </w:t>
       </w:r>
-      <w:hyperlink r:id="rId7" w:history="1">
+      <w:hyperlink r:id="rId9" w:history="1">
         <w:r>
           <w:rPr>
             <w:rStyle w:val="Hyperlink"/>
@@ -5860,7 +5892,7 @@
         </w:rPr>
         <w:t xml:space="preserve"> </w:t>
       </w:r>
-      <w:hyperlink r:id="rId8" w:anchor="bib13" w:history="1">
+      <w:hyperlink r:id="rId10" w:anchor="bib13" w:history="1">
         <w:r>
           <w:rPr>
             <w:rStyle w:val="Hyperlink"/>
@@ -5901,6 +5933,56 @@
     </w:sectPr>
   </w:body>
 </w:document>
+</file>
+
+<file path=word/endnotes.xml><?xml version="1.0" encoding="utf-8"?>
+<w:endnotes xmlns:wpc="http://schemas.microsoft.com/office/word/2010/wordprocessingCanvas" xmlns:cx="http://schemas.microsoft.com/office/drawing/2014/chartex" xmlns:cx1="http://schemas.microsoft.com/office/drawing/2015/9/8/chartex" xmlns:cx2="http://schemas.microsoft.com/office/drawing/2015/10/21/chartex" xmlns:cx3="http://schemas.microsoft.com/office/drawing/2016/5/9/chartex" xmlns:cx4="http://schemas.microsoft.com/office/drawing/2016/5/10/chartex" xmlns:cx5="http://schemas.microsoft.com/office/drawing/2016/5/11/chartex" xmlns:cx6="http://schemas.microsoft.com/office/drawing/2016/5/12/chartex" xmlns:cx7="http://schemas.microsoft.com/office/drawing/2016/5/13/chartex" xmlns:cx8="http://schemas.microsoft.com/office/drawing/2016/5/14/chartex" xmlns:mc="http://schemas.openxmlformats.org/markup-compatibility/2006" xmlns:aink="http://schemas.microsoft.com/office/drawing/2016/ink" xmlns:am3d="http://schemas.microsoft.com/office/drawing/2017/model3d" xmlns:o="urn:schemas-microsoft-com:office:office" xmlns:oel="http://schemas.microsoft.com/office/2019/extlst" xmlns:r="http://schemas.openxmlformats.org/officeDocument/2006/relationships" xmlns:m="http://schemas.openxmlformats.org/officeDocument/2006/math" xmlns:v="urn:schemas-microsoft-com:vml" xmlns:wp14="http://schemas.microsoft.com/office/word/2010/wordprocessingDrawing" xmlns:wp="http://schemas.openxmlformats.org/drawingml/2006/wordprocessingDrawing" xmlns:w10="urn:schemas-microsoft-com:office:word" xmlns:w="http://schemas.openxmlformats.org/wordprocessingml/2006/main" xmlns:w14="http://schemas.microsoft.com/office/word/2010/wordml" xmlns:w15="http://schemas.microsoft.com/office/word/2012/wordml" xmlns:w16cex="http://schemas.microsoft.com/office/word/2018/wordml/cex" xmlns:w16cid="http://schemas.microsoft.com/office/word/2016/wordml/cid" xmlns:w16="http://schemas.microsoft.com/office/word/2018/wordml" xmlns:w16sdtdh="http://schemas.microsoft.com/office/word/2020/wordml/sdtdatahash" xmlns:w16se="http://schemas.microsoft.com/office/word/2015/wordml/symex" xmlns:wpg="http://schemas.microsoft.com/office/word/2010/wordprocessingGroup" xmlns:wpi="http://schemas.microsoft.com/office/word/2010/wordprocessingInk" xmlns:wne="http://schemas.microsoft.com/office/word/2006/wordml" xmlns:wps="http://schemas.microsoft.com/office/word/2010/wordprocessingShape" mc:Ignorable="w14 w15 w16se w16cid w16 w16cex w16sdtdh wp14">
+  <w:endnote w:type="separator" w:id="-1">
+    <w:p>
+      <w:pPr>
+        <w:spacing w:after="0" w:line="240" w:lineRule="auto"/>
+      </w:pPr>
+      <w:r>
+        <w:separator/>
+      </w:r>
+    </w:p>
+  </w:endnote>
+  <w:endnote w:type="continuationSeparator" w:id="0">
+    <w:p>
+      <w:pPr>
+        <w:spacing w:after="0" w:line="240" w:lineRule="auto"/>
+      </w:pPr>
+      <w:r>
+        <w:continuationSeparator/>
+      </w:r>
+    </w:p>
+  </w:endnote>
+</w:endnotes>
+</file>
+
+<file path=word/footnotes.xml><?xml version="1.0" encoding="utf-8"?>
+<w:footnotes xmlns:wpc="http://schemas.microsoft.com/office/word/2010/wordprocessingCanvas" xmlns:cx="http://schemas.microsoft.com/office/drawing/2014/chartex" xmlns:cx1="http://schemas.microsoft.com/office/drawing/2015/9/8/chartex" xmlns:cx2="http://schemas.microsoft.com/office/drawing/2015/10/21/chartex" xmlns:cx3="http://schemas.microsoft.com/office/drawing/2016/5/9/chartex" xmlns:cx4="http://schemas.microsoft.com/office/drawing/2016/5/10/chartex" xmlns:cx5="http://schemas.microsoft.com/office/drawing/2016/5/11/chartex" xmlns:cx6="http://schemas.microsoft.com/office/drawing/2016/5/12/chartex" xmlns:cx7="http://schemas.microsoft.com/office/drawing/2016/5/13/chartex" xmlns:cx8="http://schemas.microsoft.com/office/drawing/2016/5/14/chartex" xmlns:mc="http://schemas.openxmlformats.org/markup-compatibility/2006" xmlns:aink="http://schemas.microsoft.com/office/drawing/2016/ink" xmlns:am3d="http://schemas.microsoft.com/office/drawing/2017/model3d" xmlns:o="urn:schemas-microsoft-com:office:office" xmlns:oel="http://schemas.microsoft.com/office/2019/extlst" xmlns:r="http://schemas.openxmlformats.org/officeDocument/2006/relationships" xmlns:m="http://schemas.openxmlformats.org/officeDocument/2006/math" xmlns:v="urn:schemas-microsoft-com:vml" xmlns:wp14="http://schemas.microsoft.com/office/word/2010/wordprocessingDrawing" xmlns:wp="http://schemas.openxmlformats.org/drawingml/2006/wordprocessingDrawing" xmlns:w10="urn:schemas-microsoft-com:office:word" xmlns:w="http://schemas.openxmlformats.org/wordprocessingml/2006/main" xmlns:w14="http://schemas.microsoft.com/office/word/2010/wordml" xmlns:w15="http://schemas.microsoft.com/office/word/2012/wordml" xmlns:w16cex="http://schemas.microsoft.com/office/word/2018/wordml/cex" xmlns:w16cid="http://schemas.microsoft.com/office/word/2016/wordml/cid" xmlns:w16="http://schemas.microsoft.com/office/word/2018/wordml" xmlns:w16sdtdh="http://schemas.microsoft.com/office/word/2020/wordml/sdtdatahash" xmlns:w16se="http://schemas.microsoft.com/office/word/2015/wordml/symex" xmlns:wpg="http://schemas.microsoft.com/office/word/2010/wordprocessingGroup" xmlns:wpi="http://schemas.microsoft.com/office/word/2010/wordprocessingInk" xmlns:wne="http://schemas.microsoft.com/office/word/2006/wordml" xmlns:wps="http://schemas.microsoft.com/office/word/2010/wordprocessingShape" mc:Ignorable="w14 w15 w16se w16cid w16 w16cex w16sdtdh wp14">
+  <w:footnote w:type="separator" w:id="-1">
+    <w:p>
+      <w:pPr>
+        <w:spacing w:after="0" w:line="240" w:lineRule="auto"/>
+      </w:pPr>
+      <w:r>
+        <w:separator/>
+      </w:r>
+    </w:p>
+  </w:footnote>
+  <w:footnote w:type="continuationSeparator" w:id="0">
+    <w:p>
+      <w:pPr>
+        <w:spacing w:after="0" w:line="240" w:lineRule="auto"/>
+      </w:pPr>
+      <w:r>
+        <w:continuationSeparator/>
+      </w:r>
+    </w:p>
+  </w:footnote>
+</w:footnotes>
 </file>
 
 <file path=word/numbering.xml><?xml version="1.0" encoding="utf-8"?>
@@ -7259,6 +7341,7 @@
   <w:style w:type="character" w:default="1" w:styleId="Fontepargpadro">
     <w:name w:val="Default Paragraph Font"/>
     <w:uiPriority w:val="1"/>
+    <w:semiHidden/>
     <w:unhideWhenUsed/>
   </w:style>
   <w:style w:type="table" w:default="1" w:styleId="Tabelanormal">
@@ -7622,6 +7705,50 @@
       </w:tblBorders>
     </w:tblPr>
   </w:style>
+  <w:style w:type="paragraph" w:styleId="Cabealho">
+    <w:name w:val="header"/>
+    <w:basedOn w:val="Normal"/>
+    <w:link w:val="CabealhoChar"/>
+    <w:uiPriority w:val="99"/>
+    <w:unhideWhenUsed/>
+    <w:rsid w:val="00375B8D"/>
+    <w:pPr>
+      <w:tabs>
+        <w:tab w:val="center" w:pos="4252"/>
+        <w:tab w:val="right" w:pos="8504"/>
+      </w:tabs>
+      <w:spacing w:after="0" w:line="240" w:lineRule="auto"/>
+    </w:pPr>
+  </w:style>
+  <w:style w:type="character" w:customStyle="1" w:styleId="CabealhoChar">
+    <w:name w:val="Cabeçalho Char"/>
+    <w:basedOn w:val="Fontepargpadro"/>
+    <w:link w:val="Cabealho"/>
+    <w:uiPriority w:val="99"/>
+    <w:rsid w:val="00375B8D"/>
+  </w:style>
+  <w:style w:type="paragraph" w:styleId="Rodap">
+    <w:name w:val="footer"/>
+    <w:basedOn w:val="Normal"/>
+    <w:link w:val="RodapChar"/>
+    <w:uiPriority w:val="99"/>
+    <w:unhideWhenUsed/>
+    <w:rsid w:val="00375B8D"/>
+    <w:pPr>
+      <w:tabs>
+        <w:tab w:val="center" w:pos="4252"/>
+        <w:tab w:val="right" w:pos="8504"/>
+      </w:tabs>
+      <w:spacing w:after="0" w:line="240" w:lineRule="auto"/>
+    </w:pPr>
+  </w:style>
+  <w:style w:type="character" w:customStyle="1" w:styleId="RodapChar">
+    <w:name w:val="Rodapé Char"/>
+    <w:basedOn w:val="Fontepargpadro"/>
+    <w:link w:val="Rodap"/>
+    <w:uiPriority w:val="99"/>
+    <w:rsid w:val="00375B8D"/>
+  </w:style>
 </w:styles>
 </file>
 

</xml_diff>